<commit_message>
Publish AJBA critical revision 2026-07
</commit_message>
<xml_diff>
--- a/docs/cover_letter_bioessays.docx
+++ b/docs/cover_letter_bioessays.docx
@@ -7,7 +7,7 @@
         <w:jc w:val="left"/>
       </w:pPr>
       <w:r>
-        <w:t>June 19, 2026</w:t>
+        <w:t>July 11, 2026</w:t>
       </w:r>
     </w:p>
     <w:p/>
@@ -85,7 +85,7 @@
         <w:rPr>
           <w:b/>
         </w:rPr>
-        <w:t>Tatsuki Onishi</w:t>
+        <w:t>Onishi Tatsuki</w:t>
       </w:r>
     </w:p>
     <w:p>
@@ -93,7 +93,7 @@
         <w:rPr>
           <w:sz w:val="20"/>
         </w:rPr>
-        <w:t>[Affiliation to be added]</w:t>
+        <w:t>Data Science and AI Innovation Research Promotion Center</w:t>
       </w:r>
     </w:p>
     <w:p>

</xml_diff>

<commit_message>
Publish final AJBA critical revision 2026-07
</commit_message>
<xml_diff>
--- a/docs/cover_letter_bioessays.docx
+++ b/docs/cover_letter_bioessays.docx
@@ -7,7 +7,7 @@
         <w:jc w:val="left"/>
       </w:pPr>
       <w:r>
-        <w:t>June 19, 2026</w:t>
+        <w:t>July 11, 2026</w:t>
       </w:r>
     </w:p>
     <w:p/>
@@ -85,7 +85,7 @@
         <w:rPr>
           <w:b/>
         </w:rPr>
-        <w:t>Tatsuki Onishi</w:t>
+        <w:t>Onishi Tatsuki</w:t>
       </w:r>
     </w:p>
     <w:p>
@@ -93,7 +93,7 @@
         <w:rPr>
           <w:sz w:val="20"/>
         </w:rPr>
-        <w:t>[Affiliation to be added]</w:t>
+        <w:t>Data Science and AI Innovation Research Promotion Center</w:t>
       </w:r>
     </w:p>
     <w:p>

</xml_diff>